<commit_message>
Add singular multivariate forecasting workflow
</commit_message>
<xml_diff>
--- a/examples/multivariate/doc/README.docx
+++ b/examples/multivariate/doc/README.docx
@@ -2,7 +2,7 @@
 <file path=word/document.xml><?xml version="1.0" encoding="utf-8"?>
 <w:document xmlns:w="http://schemas.openxmlformats.org/wordprocessingml/2006/main" xmlns:m="http://schemas.openxmlformats.org/officeDocument/2006/math" xmlns:r="http://schemas.openxmlformats.org/officeDocument/2006/relationships" xmlns:o="urn:schemas-microsoft-com:office:office" xmlns:v="urn:schemas-microsoft-com:vml" xmlns:w10="urn:schemas-microsoft-com:office:word" xmlns:a="http://schemas.openxmlformats.org/drawingml/2006/main" xmlns:pic="http://schemas.openxmlformats.org/drawingml/2006/picture" xmlns:wp="http://schemas.openxmlformats.org/drawingml/2006/wordprocessingDrawing">
   <w:body>
-    <w:bookmarkStart w:id="17" w:name="multivariate-forecasting-examples"/>
+    <w:bookmarkStart w:id="23" w:name="multivariate-forecasting-examples"/>
     <w:p>
       <w:pPr>
         <w:pStyle w:val="Heading1"/>
@@ -70,13 +70,31 @@
         <w:t xml:space="preserve"> </w:t>
       </w:r>
       <w:r>
-        <w:t xml:space="preserve">receive their own forecasting pipelines and feed the recursive multistep</w:t>
-      </w:r>
-      <w:r>
-        <w:t xml:space="preserve"> </w:t>
-      </w:r>
-      <w:r>
-        <w:t xml:space="preserve">process.</w:t>
+        <w:t xml:space="preserve">either enter as aligned regressors in the singular branch (</w:t>
+      </w:r>
+      <w:r>
+        <w:rPr>
+          <w:rStyle w:val="VerbatimChar"/>
+        </w:rPr>
+        <w:t xml:space="preserve">sw = 1</w:t>
+      </w:r>
+      <w:r>
+        <w:t xml:space="preserve">) or receive</w:t>
+      </w:r>
+      <w:r>
+        <w:t xml:space="preserve"> </w:t>
+      </w:r>
+      <w:r>
+        <w:t xml:space="preserve">their own forecasting pipelines in the sliding-window branch (</w:t>
+      </w:r>
+      <w:r>
+        <w:rPr>
+          <w:rStyle w:val="VerbatimChar"/>
+        </w:rPr>
+        <w:t xml:space="preserve">sw &gt; 1</w:t>
+      </w:r>
+      <w:r>
+        <w:t xml:space="preserve">).</w:t>
       </w:r>
     </w:p>
     <w:p>
@@ -84,13 +102,7 @@
         <w:pStyle w:val="BodyText"/>
       </w:pPr>
       <w:r>
-        <w:t xml:space="preserve">The examples in this folder explain the new abstractions in the order a reader</w:t>
-      </w:r>
-      <w:r>
-        <w:t xml:space="preserve"> </w:t>
-      </w:r>
-      <w:r>
-        <w:t xml:space="preserve">typically needs them:</w:t>
+        <w:t xml:space="preserve">The examples in this folder now follow the most didactic order:</w:t>
       </w:r>
     </w:p>
     <w:p>
@@ -114,7 +126,16 @@
         </w:numPr>
       </w:pPr>
       <w:r>
-        <w:t xml:space="preserve">then the variable-specific pipeline specification</w:t>
+        <w:t xml:space="preserve">then the singular multivariate branch built on</w:t>
+      </w:r>
+      <w:r>
+        <w:t xml:space="preserve"> </w:t>
+      </w:r>
+      <w:r>
+        <w:rPr>
+          <w:rStyle w:val="VerbatimChar"/>
+        </w:rPr>
+        <w:t xml:space="preserve">ts_reg_mv</w:t>
       </w:r>
     </w:p>
     <w:p>
@@ -126,10 +147,19 @@
         </w:numPr>
       </w:pPr>
       <w:r>
-        <w:t xml:space="preserve">then the multivariate orchestrator that reuses the existing univariate learners</w:t>
-      </w:r>
-    </w:p>
-    <w:bookmarkStart w:id="16" w:name="current-examples"/>
+        <w:t xml:space="preserve">then the sliding-window multivariate branch built on</w:t>
+      </w:r>
+      <w:r>
+        <w:t xml:space="preserve"> </w:t>
+      </w:r>
+      <w:r>
+        <w:rPr>
+          <w:rStyle w:val="VerbatimChar"/>
+        </w:rPr>
+        <w:t xml:space="preserve">ts_regsw_mv</w:t>
+      </w:r>
+    </w:p>
+    <w:bookmarkStart w:id="22" w:name="current-examples"/>
     <w:p>
       <w:pPr>
         <w:pStyle w:val="Heading2"/>
@@ -138,7 +168,7 @@
         <w:t xml:space="preserve">Current examples</w:t>
       </w:r>
     </w:p>
-    <w:bookmarkStart w:id="12" w:name="block-1-data-and-alignment"/>
+    <w:bookmarkStart w:id="11" w:name="block-1-data-and-alignment"/>
     <w:p>
       <w:pPr>
         <w:pStyle w:val="Heading3"/>
@@ -213,47 +243,42 @@
           <w:rPr>
             <w:rStyle w:val="Hyperlink"/>
           </w:rPr>
-          <w:t xml:space="preserve">02-materialize-windows-mv.md</w:t>
+          <w:t xml:space="preserve">02-singular-train-test-split-mv.md</w:t>
         </w:r>
       </w:hyperlink>
       <w:r>
         <w:t xml:space="preserve"> </w:t>
       </w:r>
       <w:r>
-        <w:t xml:space="preserve">- materialize the lagged multivariate blocks and inspect the individual delayed terms exposed to the learners.</w:t>
-      </w:r>
-    </w:p>
-    <w:p>
-      <w:pPr>
-        <w:pStyle w:val="Compact"/>
-        <w:numPr>
-          <w:ilvl w:val="0"/>
-          <w:numId w:val="1002"/>
-        </w:numPr>
-      </w:pPr>
-      <w:hyperlink r:id="rId11">
-        <w:r>
-          <w:rPr>
-            <w:rStyle w:val="Hyperlink"/>
-          </w:rPr>
-          <w:t xml:space="preserve">03-train-test-split-mv.md</w:t>
-        </w:r>
-      </w:hyperlink>
-      <w:r>
-        <w:t xml:space="preserve"> </w:t>
-      </w:r>
-      <w:r>
-        <w:t xml:space="preserve">- inspect how the aligned object and its lagged materializations behave across the time-aware train/test split.</w:t>
-      </w:r>
-    </w:p>
-    <w:bookmarkEnd w:id="12"/>
-    <w:bookmarkStart w:id="15" w:name="block-2-forecasting-workflow"/>
+        <w:t xml:space="preserve">- inspect how aligned multivariate observations are split for the singular branch (</w:t>
+      </w:r>
+      <w:r>
+        <w:rPr>
+          <w:rStyle w:val="VerbatimChar"/>
+        </w:rPr>
+        <w:t xml:space="preserve">sw = 1</w:t>
+      </w:r>
+      <w:r>
+        <w:t xml:space="preserve">).</w:t>
+      </w:r>
+    </w:p>
+    <w:bookmarkEnd w:id="11"/>
+    <w:bookmarkStart w:id="15" w:name="X66b8b770af1d65257f8d98993bc3afb3ba51845"/>
     <w:p>
       <w:pPr>
         <w:pStyle w:val="Heading3"/>
       </w:pPr>
       <w:r>
-        <w:t xml:space="preserve">Block 2: Forecasting workflow</w:t>
+        <w:t xml:space="preserve">Block 2: Singular multivariate branch (</w:t>
+      </w:r>
+      <w:r>
+        <w:rPr>
+          <w:rStyle w:val="VerbatimChar"/>
+        </w:rPr>
+        <w:t xml:space="preserve">ts_reg_mv</w:t>
+      </w:r>
+      <w:r>
+        <w:t xml:space="preserve">)</w:t>
       </w:r>
     </w:p>
     <w:p>
@@ -264,19 +289,42 @@
           <w:numId w:val="1003"/>
         </w:numPr>
       </w:pPr>
+      <w:hyperlink r:id="rId12">
+        <w:r>
+          <w:rPr>
+            <w:rStyle w:val="Hyperlink"/>
+          </w:rPr>
+          <w:t xml:space="preserve">03-linear-regression-mv.md</w:t>
+        </w:r>
+      </w:hyperlink>
+      <w:r>
+        <w:t xml:space="preserve"> </w:t>
+      </w:r>
+      <w:r>
+        <w:t xml:space="preserve">- use a formula-based linear regression as the simplest target-centered singular multivariate model.</w:t>
+      </w:r>
+    </w:p>
+    <w:p>
+      <w:pPr>
+        <w:pStyle w:val="Compact"/>
+        <w:numPr>
+          <w:ilvl w:val="0"/>
+          <w:numId w:val="1003"/>
+        </w:numPr>
+      </w:pPr>
       <w:hyperlink r:id="rId13">
         <w:r>
           <w:rPr>
             <w:rStyle w:val="Hyperlink"/>
           </w:rPr>
-          <w:t xml:space="preserve">04-deterministic-auxiliary-models.md</w:t>
+          <w:t xml:space="preserve">04-arimax-regression-mv.md</w:t>
         </w:r>
       </w:hyperlink>
       <w:r>
         <w:t xml:space="preserve"> </w:t>
       </w:r>
       <w:r>
-        <w:t xml:space="preserve">- inspect when auxiliary variables should use deterministic pipelines such as</w:t>
+        <w:t xml:space="preserve">- extend the ARIMA branch to aligned auxiliaries through</w:t>
       </w:r>
       <w:r>
         <w:t xml:space="preserve"> </w:t>
@@ -285,34 +333,13 @@
         <w:rPr>
           <w:rStyle w:val="VerbatimChar"/>
         </w:rPr>
-        <w:t xml:space="preserve">ts_deterministic()</w:t>
-      </w:r>
-      <w:r>
-        <w:t xml:space="preserve">,</w:t>
-      </w:r>
-      <w:r>
-        <w:t xml:space="preserve"> </w:t>
-      </w:r>
-      <w:r>
-        <w:rPr>
-          <w:rStyle w:val="VerbatimChar"/>
-        </w:rPr>
-        <w:t xml:space="preserve">ts_periodic()</w:t>
-      </w:r>
-      <w:r>
-        <w:t xml:space="preserve">, and</w:t>
-      </w:r>
-      <w:r>
-        <w:t xml:space="preserve"> </w:t>
-      </w:r>
-      <w:r>
-        <w:rPr>
-          <w:rStyle w:val="VerbatimChar"/>
-        </w:rPr>
-        <w:t xml:space="preserve">ts_persist()</w:t>
-      </w:r>
-      <w:r>
-        <w:t xml:space="preserve">.</w:t>
+        <w:t xml:space="preserve">ts_arimax()</w:t>
+      </w:r>
+      <w:r>
+        <w:t xml:space="preserve"> </w:t>
+      </w:r>
+      <w:r>
+        <w:t xml:space="preserve">and auxiliary support models.</w:t>
       </w:r>
     </w:p>
     <w:p>
@@ -328,19 +355,201 @@
           <w:rPr>
             <w:rStyle w:val="Hyperlink"/>
           </w:rPr>
-          <w:t xml:space="preserve">05-target-centered-regression.md</w:t>
+          <w:t xml:space="preserve">05-vector-autoregression-mv.md</w:t>
         </w:r>
       </w:hyperlink>
       <w:r>
         <w:t xml:space="preserve"> </w:t>
       </w:r>
       <w:r>
-        <w:t xml:space="preserve">- build a complete multivariate forecasting system from an existing benchmark in the package and inspect one-step and multistep prediction.</w:t>
+        <w:t xml:space="preserve">- fit a vector autoregression over the whole system while preserving a distinguished target</w:t>
+      </w:r>
+      <w:r>
+        <w:t xml:space="preserve"> </w:t>
+      </w:r>
+      <w:r>
+        <w:rPr>
+          <w:rStyle w:val="VerbatimChar"/>
+        </w:rPr>
+        <w:t xml:space="preserve">y</w:t>
+      </w:r>
+      <w:r>
+        <w:t xml:space="preserve">.</w:t>
       </w:r>
     </w:p>
     <w:bookmarkEnd w:id="15"/>
-    <w:bookmarkEnd w:id="16"/>
-    <w:bookmarkEnd w:id="17"/>
+    <w:bookmarkStart w:id="21" w:name="Xb7f4684ddcdb5d095068b4f3778f09b5023a58b"/>
+    <w:p>
+      <w:pPr>
+        <w:pStyle w:val="Heading3"/>
+      </w:pPr>
+      <w:r>
+        <w:t xml:space="preserve">Block 3: Sliding-window multivariate branch (</w:t>
+      </w:r>
+      <w:r>
+        <w:rPr>
+          <w:rStyle w:val="VerbatimChar"/>
+        </w:rPr>
+        <w:t xml:space="preserve">ts_regsw_mv</w:t>
+      </w:r>
+      <w:r>
+        <w:t xml:space="preserve">)</w:t>
+      </w:r>
+    </w:p>
+    <w:p>
+      <w:pPr>
+        <w:pStyle w:val="Compact"/>
+        <w:numPr>
+          <w:ilvl w:val="0"/>
+          <w:numId w:val="1004"/>
+        </w:numPr>
+      </w:pPr>
+      <w:hyperlink r:id="rId16">
+        <w:r>
+          <w:rPr>
+            <w:rStyle w:val="Hyperlink"/>
+          </w:rPr>
+          <w:t xml:space="preserve">06-materialize-windows-mv.md</w:t>
+        </w:r>
+      </w:hyperlink>
+      <w:r>
+        <w:t xml:space="preserve"> </w:t>
+      </w:r>
+      <w:r>
+        <w:t xml:space="preserve">- materialize the lagged multivariate blocks and inspect the individual delayed terms exposed to the learners.</w:t>
+      </w:r>
+    </w:p>
+    <w:p>
+      <w:pPr>
+        <w:pStyle w:val="Compact"/>
+        <w:numPr>
+          <w:ilvl w:val="0"/>
+          <w:numId w:val="1004"/>
+        </w:numPr>
+      </w:pPr>
+      <w:hyperlink r:id="rId17">
+        <w:r>
+          <w:rPr>
+            <w:rStyle w:val="Hyperlink"/>
+          </w:rPr>
+          <w:t xml:space="preserve">07-train-test-split-windowed-mv.md</w:t>
+        </w:r>
+      </w:hyperlink>
+      <w:r>
+        <w:t xml:space="preserve"> </w:t>
+      </w:r>
+      <w:r>
+        <w:t xml:space="preserve">- inspect how the lagged multivariate representation should be split for sliding-window forecasting.</w:t>
+      </w:r>
+    </w:p>
+    <w:p>
+      <w:pPr>
+        <w:pStyle w:val="Compact"/>
+        <w:numPr>
+          <w:ilvl w:val="0"/>
+          <w:numId w:val="1004"/>
+        </w:numPr>
+      </w:pPr>
+      <w:hyperlink r:id="rId18">
+        <w:r>
+          <w:rPr>
+            <w:rStyle w:val="Hyperlink"/>
+          </w:rPr>
+          <w:t xml:space="preserve">08-deterministic-auxiliary-models.md</w:t>
+        </w:r>
+      </w:hyperlink>
+      <w:r>
+        <w:t xml:space="preserve"> </w:t>
+      </w:r>
+      <w:r>
+        <w:t xml:space="preserve">- inspect when auxiliary variables should use deterministic pipelines such as</w:t>
+      </w:r>
+      <w:r>
+        <w:t xml:space="preserve"> </w:t>
+      </w:r>
+      <w:r>
+        <w:rPr>
+          <w:rStyle w:val="VerbatimChar"/>
+        </w:rPr>
+        <w:t xml:space="preserve">ts_deterministic()</w:t>
+      </w:r>
+      <w:r>
+        <w:t xml:space="preserve">,</w:t>
+      </w:r>
+      <w:r>
+        <w:t xml:space="preserve"> </w:t>
+      </w:r>
+      <w:r>
+        <w:rPr>
+          <w:rStyle w:val="VerbatimChar"/>
+        </w:rPr>
+        <w:t xml:space="preserve">ts_periodic()</w:t>
+      </w:r>
+      <w:r>
+        <w:t xml:space="preserve">, and</w:t>
+      </w:r>
+      <w:r>
+        <w:t xml:space="preserve"> </w:t>
+      </w:r>
+      <w:r>
+        <w:rPr>
+          <w:rStyle w:val="VerbatimChar"/>
+        </w:rPr>
+        <w:t xml:space="preserve">ts_persist()</w:t>
+      </w:r>
+      <w:r>
+        <w:t xml:space="preserve">.</w:t>
+      </w:r>
+    </w:p>
+    <w:p>
+      <w:pPr>
+        <w:pStyle w:val="Compact"/>
+        <w:numPr>
+          <w:ilvl w:val="0"/>
+          <w:numId w:val="1004"/>
+        </w:numPr>
+      </w:pPr>
+      <w:hyperlink r:id="rId19">
+        <w:r>
+          <w:rPr>
+            <w:rStyle w:val="Hyperlink"/>
+          </w:rPr>
+          <w:t xml:space="preserve">09-target-centered-regression.md</w:t>
+        </w:r>
+      </w:hyperlink>
+      <w:r>
+        <w:t xml:space="preserve"> </w:t>
+      </w:r>
+      <w:r>
+        <w:t xml:space="preserve">- build a complete multivariate forecasting system with deterministic auxiliary variables and inspect one-step and multistep prediction.</w:t>
+      </w:r>
+    </w:p>
+    <w:p>
+      <w:pPr>
+        <w:pStyle w:val="Compact"/>
+        <w:numPr>
+          <w:ilvl w:val="0"/>
+          <w:numId w:val="1004"/>
+        </w:numPr>
+      </w:pPr>
+      <w:hyperlink r:id="rId20">
+        <w:r>
+          <w:rPr>
+            <w:rStyle w:val="Hyperlink"/>
+          </w:rPr>
+          <w:t xml:space="preserve">10-stock-close-regression.md</w:t>
+        </w:r>
+      </w:hyperlink>
+      <w:r>
+        <w:t xml:space="preserve"> </w:t>
+      </w:r>
+      <w:r>
+        <w:t xml:space="preserve">- forecast stock closing prices from non-deterministic auxiliary variables and inspect a mixed workflow with MLP, ELM, DARIMA, and WARMA submodels.</w:t>
+      </w:r>
+    </w:p>
+    <w:bookmarkEnd w:id="21"/>
+    <w:bookmarkEnd w:id="22"/>
+    <w:bookmarkEnd w:id="23"/>
     <w:sectPr>
       <w:footnotePr>
         <w:numRestart w:val="eachSect"/>
@@ -564,6 +773,9 @@
     <w:abstractNumId w:val="991"/>
   </w:num>
   <w:num w:numId="1003">
+    <w:abstractNumId w:val="991"/>
+  </w:num>
+  <w:num w:numId="1004">
     <w:abstractNumId w:val="991"/>
   </w:num>
 </w:numbering>

</xml_diff>